<commit_message>
Specify equal assessment weighting and project replacement in Mensch und Umwelt
</commit_message>
<xml_diff>
--- a/downloads/Curriculum_Mensch_und_Umwelt_Thomaeum.docx
+++ b/downloads/Curriculum_Mensch_und_Umwelt_Thomaeum.docx
@@ -7072,7 +7072,7 @@
     </w:p>
     <w:p>
       <w:r>
-        <w:t>Leistungsbewertung erfasst die im Unterricht entwickelten fachlichen und prozessbezogenen Kompetenzen. Maßgeblich sind die Qualität, Nachvollziehbarkeit und Selbstständigkeit der Leistung sowie ihre Entwicklung über den Beurteilungszeitraum. Anforderungen, Kriterien, Hilfsmittel und Abgabetermine werden rechtzeitig bekannt gegeben. Die Bereiche Schriftliche Arbeiten und Sonstige Leistungen im Unterricht werden gemäß § 6 APO-S I angemessen berücksichtigt. [6]</w:t>
+        <w:t>Leistungsbewertung erfasst die im Unterricht entwickelten fachlichen und prozessbezogenen Kompetenzen. Maßgeblich sind die Qualität, Nachvollziehbarkeit und Selbstständigkeit der Leistung sowie ihre Entwicklung über den Beurteilungszeitraum. Anforderungen, Kriterien, Hilfsmittel und Abgabetermine werden rechtzeitig bekannt gegeben. Die Bereiche Schriftliche Arbeiten (Klassenarbeiten einschließlich einer ersetzenden Projektleistung) und Sonstige Leistungen im Unterricht gehen mit jeweils 50 % gleichgewichtig in die Gesamtbewertung ein. Diese schulische Festlegung konkretisiert § 6 APO-S I. [6]</w:t>
       </w:r>
     </w:p>
     <w:p>
@@ -7085,7 +7085,7 @@
     </w:p>
     <w:p>
       <w:r>
-        <w:t>Im Wahlpflichtunterricht der Klassen 9 und 10 am neunjährigen Gymnasium sind je Schuljahr vier Klassenarbeiten mit einer Dauer von ein bis zwei Unterrichtsstunden vorgesehen, entsprechend 45 bis 90 Minuten. Die konkrete Dauer innerhalb dieser Bandbreite richtet sich nach den fachkonferenzbezogenen Festlegungen und wird angekündigt. Einmal je Schuljahr kann eine Klassenarbeit durch eine andere, in der Regel schriftliche, in Ausnahmefällen gleichwertige nicht schriftliche Leistungsüberprüfung ersetzt werden (§ 6 Absatz 8 APO-S I). [6]</w:t>
+        <w:t>Im Wahlpflichtunterricht der Klassen 9 und 10 am neunjährigen Gymnasium sind je Schuljahr vier Klassenarbeiten mit einer Dauer von ein bis zwei Unterrichtsstunden vorgesehen, entsprechend 45 bis 90 Minuten. Die konkrete Dauer innerhalb dieser Bandbreite richtet sich nach den fachkonferenzbezogenen Festlegungen und wird angekündigt. Einmal je Schuljahr kann eine Klassenarbeit durch eine gleichwertige Projektleistung ersetzt werden. Diese umfasst in der Regel eine schriftliche Dokumentation mit individueller Auswertung; eine gleichwertige nicht schriftliche Form ist nach § 6 Absatz 8 APO-S I in Ausnahmefällen möglich. [6]</w:t>
       </w:r>
     </w:p>
     <w:p>
@@ -7116,7 +7116,7 @@
     </w:p>
     <w:p>
       <w:r>
-        <w:t>Die fachlich vereinbarte Gewichtung der beiden Beurteilungsbereiche wird der Lerngruppe zu Beginn des Schuljahres erläutert. Ein Bewertungsraster für ein Projekt ist keine automatische Formel für die Halbjahresnote. Dieselbe Leistung wird nicht doppelt in verschiedenen Bereichen gewertet. Wird eine Klassenarbeit ersetzt, werden Umfang, individuelle Nachweise und Zuordnung vorab festgelegt; ein Projektbericht mit eigener Auswertung bietet dafür eine geeignete schriftliche Form.</w:t>
+        <w:t>Die Gewichtung von 50 % Schriftlichen Arbeiten und 50 % Sonstigen Leistungen wird zu Schuljahresbeginn erläutert. Eine ersetzende Projektleistung zählt anstelle der betreffenden Klassenarbeit zum Bereich Schriftliche Arbeiten. Umfang, Kriterien, Dokumentation und individuelle Nachweise werden vorab festgelegt. Auch bei Gruppenprojekten wird die Leistung jeder Person gesondert beurteilt. Dieselbe Leistung wird nicht zusätzlich bei den Sonstigen Leistungen angerechnet.</w:t>
       </w:r>
     </w:p>
     <w:p>

</xml_diff>

<commit_message>
Align four-K educational rationale in Mensch und Umwelt and project course
</commit_message>
<xml_diff>
--- a/downloads/Curriculum_Mensch_und_Umwelt_Thomaeum.docx
+++ b/downloads/Curriculum_Mensch_und_Umwelt_Thomaeum.docx
@@ -278,6 +278,12 @@
     <w:p>
       <w:r>
         <w:t>Kritisches Denken, Kommunikation, Kollaboration und Kreativität sind die vier K des internationalen P21 Framework for 21st Century Learning. Sie beschreiben Fähigkeiten, mit denen Lernende Fachwissen in anspruchsvollen Situationen einsetzen. Im Kurs werden sie an fachlichen Aufgaben entwickelt und durch konkrete Leistungen sichtbar. [4]</w:t>
+      </w:r>
+    </w:p>
+    <w:p>
+      <w:pPr/>
+      <w:r>
+        <w:t>Die vier K bezeichnen genuin menschliche Fähigkeiten des Verstehens, Gestaltens und verantwortlichen Handelns. Sie ergänzen das klassische Bildungsideal, statt es zu ersetzen. Kenntnisse aus Biologie, Chemie und Physik sowie eigene Untersuchungserfahrungen bilden ihre Grundlage: Ohne Wissen über Ursachen und bisherige Lösungsansätze bleibt Kreativität beliebig; ohne sichere allgemeine und fachsprachliche Mittel gelingt keine lösungsgerichtete Kommunikation. Kritisches Denken setzt Sachkenntnis und Kriterien für belastbare Belege voraus. Kollaboration verlangt eigene Beiträge, Zuhören und gemeinsame Verantwortung. Generative KI kann Vorschläge und Darstellungen erzeugen, übernimmt aber nicht die menschliche Verantwortung für deren Prüfung und Anwendung auf konkrete Umwelt- und Gesundheitsfragen. Deshalb werden die vier K im Unterricht und in Leistungsnachweisen deutlich sichtbar gemacht, stets auf der Grundlage fachlicher Bildung.</w:t>
       </w:r>
     </w:p>
     <w:tbl>

</xml_diff>

<commit_message>
Use dotted numbers in curriculum subheadings
</commit_message>
<xml_diff>
--- a/downloads/Curriculum_Mensch_und_Umwelt_Thomaeum.docx
+++ b/downloads/Curriculum_Mensch_und_Umwelt_Thomaeum.docx
@@ -4003,7 +4003,7 @@
         <w:pageBreakBefore/>
       </w:pPr>
       <w:r>
-        <w:t>09 1 Natürlicher und anthropogener Treibhauseffekt</w:t>
+        <w:t>09.1 Natürlicher und anthropogener Treibhauseffekt</w:t>
       </w:r>
       <w:bookmarkEnd w:id="7"/>
     </w:p>
@@ -4129,7 +4129,7 @@
         <w:pageBreakBefore/>
       </w:pPr>
       <w:r>
-        <w:t>09 2 Klimawandel und globale Auswirkungen</w:t>
+        <w:t>09.2 Klimawandel und globale Auswirkungen</w:t>
       </w:r>
       <w:bookmarkEnd w:id="8"/>
     </w:p>
@@ -4263,7 +4263,7 @@
         <w:pageBreakBefore/>
       </w:pPr>
       <w:r>
-        <w:t>09 3 Klimaschutz und begründete Entscheidungen</w:t>
+        <w:t>09.3 Klimaschutz und begründete Entscheidungen</w:t>
       </w:r>
       <w:bookmarkEnd w:id="9"/>
     </w:p>
@@ -4384,7 +4384,7 @@
         <w:pageBreakBefore/>
       </w:pPr>
       <w:r>
-        <w:t>09 4 Klimadaten verstehen</w:t>
+        <w:t>09.4 Klimadaten verstehen</w:t>
       </w:r>
       <w:bookmarkEnd w:id="10"/>
     </w:p>
@@ -4505,7 +4505,7 @@
         <w:pageBreakBefore/>
       </w:pPr>
       <w:r>
-        <w:t>09 5 Energieformen und Energieträger</w:t>
+        <w:t>09.5 Energieformen und Energieträger</w:t>
       </w:r>
       <w:bookmarkEnd w:id="11"/>
     </w:p>
@@ -4618,7 +4618,7 @@
         <w:pageBreakBefore/>
       </w:pPr>
       <w:r>
-        <w:t>09 6 Energieträger und Technologien im Vergleich</w:t>
+        <w:t>09.6 Energieträger und Technologien im Vergleich</w:t>
       </w:r>
       <w:bookmarkEnd w:id="12"/>
     </w:p>
@@ -4739,7 +4739,7 @@
         <w:pageBreakBefore/>
       </w:pPr>
       <w:r>
-        <w:t>09 7 Bauprojekt zur Energienutzung</w:t>
+        <w:t>09.7 Bauprojekt zur Energienutzung</w:t>
       </w:r>
       <w:bookmarkEnd w:id="13"/>
     </w:p>
@@ -4860,7 +4860,7 @@
         <w:pageBreakBefore/>
       </w:pPr>
       <w:r>
-        <w:t>09 8 Energieverbrauch im Alltag</w:t>
+        <w:t>09.8 Energieverbrauch im Alltag</w:t>
       </w:r>
       <w:bookmarkEnd w:id="14"/>
     </w:p>
@@ -4981,7 +4981,7 @@
         <w:pageBreakBefore/>
       </w:pPr>
       <w:r>
-        <w:t>10 1 Ernährung und Verdauung</w:t>
+        <w:t>10.1 Ernährung und Verdauung</w:t>
       </w:r>
       <w:bookmarkEnd w:id="15"/>
     </w:p>
@@ -5102,7 +5102,7 @@
         <w:pageBreakBefore/>
       </w:pPr>
       <w:r>
-        <w:t>10 2 Blut und Blutkreislauf</w:t>
+        <w:t>10.2 Blut und Blutkreislauf</w:t>
       </w:r>
       <w:bookmarkEnd w:id="16"/>
     </w:p>
@@ -5231,7 +5231,7 @@
         <w:pageBreakBefore/>
       </w:pPr>
       <w:r>
-        <w:t>10 3 Haut und Hautschutz</w:t>
+        <w:t>10.3 Haut und Hautschutz</w:t>
       </w:r>
       <w:bookmarkEnd w:id="17"/>
     </w:p>
@@ -5352,7 +5352,7 @@
         <w:pageBreakBefore/>
       </w:pPr>
       <w:r>
-        <w:t>10 4 Skelett Muskeln und Bewegung</w:t>
+        <w:t>10.4 Skelett Muskeln und Bewegung</w:t>
       </w:r>
       <w:bookmarkEnd w:id="18"/>
     </w:p>

</xml_diff>

<commit_message>
Embed Inter and Poppins in curriculum Word downloads
</commit_message>
<xml_diff>
--- a/downloads/Curriculum_Mensch_und_Umwelt_Thomaeum.docx
+++ b/downloads/Curriculum_Mensch_und_Umwelt_Thomaeum.docx
@@ -8537,7 +8537,7 @@
       <w:jc w:val="both"/>
     </w:pPr>
     <w:rPr>
-      <w:rFonts w:ascii="Arial" w:hAnsi="Arial"/>
+      <w:rFonts w:ascii="Inter" w:hAnsi="Inter"/>
       <w:color w:val="000000"/>
       <w:sz w:val="21"/>
       <w:lang w:val="de-DE"/>
@@ -8559,7 +8559,7 @@
       <w:spacing w:after="140" w:line="276" w:lineRule="auto"/>
     </w:pPr>
     <w:rPr>
-      <w:rFonts w:ascii="Arial" w:hAnsi="Arial"/>
+      <w:rFonts w:ascii="Inter" w:hAnsi="Inter"/>
       <w:color w:val="000000"/>
       <w:sz w:val="16"/>
       <w:lang w:val="de-DE"/>
@@ -8588,7 +8588,7 @@
       <w:spacing w:after="140" w:line="276" w:lineRule="auto"/>
     </w:pPr>
     <w:rPr>
-      <w:rFonts w:ascii="Arial" w:hAnsi="Arial"/>
+      <w:rFonts w:ascii="Inter" w:hAnsi="Inter"/>
       <w:color w:val="000000"/>
       <w:sz w:val="16"/>
       <w:lang w:val="de-DE"/>
@@ -8617,7 +8617,7 @@
       <w:outlineLvl w:val="0"/>
     </w:pPr>
     <w:rPr>
-      <w:rFonts w:asciiTheme="majorHAnsi" w:eastAsiaTheme="majorEastAsia" w:hAnsiTheme="majorHAnsi" w:cstheme="majorBidi" w:ascii="Arial" w:hAnsi="Arial"/>
+      <w:rFonts w:ascii="Poppins" w:hAnsi="Poppins" w:eastAsia="Poppins" w:cs="Poppins"/>
       <w:b/>
       <w:bCs/>
       <w:color w:val="000000"/>
@@ -8643,7 +8643,7 @@
       <w:outlineLvl w:val="1"/>
     </w:pPr>
     <w:rPr>
-      <w:rFonts w:asciiTheme="majorHAnsi" w:eastAsiaTheme="majorEastAsia" w:hAnsiTheme="majorHAnsi" w:cstheme="majorBidi" w:ascii="Arial" w:hAnsi="Arial"/>
+      <w:rFonts w:ascii="Poppins" w:hAnsi="Poppins" w:eastAsia="Poppins" w:cs="Poppins"/>
       <w:b/>
       <w:bCs/>
       <w:color w:val="000000"/>
@@ -8669,7 +8669,7 @@
       <w:outlineLvl w:val="2"/>
     </w:pPr>
     <w:rPr>
-      <w:rFonts w:asciiTheme="majorHAnsi" w:eastAsiaTheme="majorEastAsia" w:hAnsiTheme="majorHAnsi" w:cstheme="majorBidi" w:ascii="Arial" w:hAnsi="Arial"/>
+      <w:rFonts w:ascii="Poppins" w:hAnsi="Poppins" w:eastAsia="Poppins" w:cs="Poppins"/>
       <w:b/>
       <w:bCs/>
       <w:color w:val="000000"/>
@@ -8910,7 +8910,7 @@
       <w:contextualSpacing/>
     </w:pPr>
     <w:rPr>
-      <w:rFonts w:asciiTheme="majorHAnsi" w:eastAsiaTheme="majorEastAsia" w:hAnsiTheme="majorHAnsi" w:cstheme="majorBidi" w:ascii="Arial" w:hAnsi="Arial"/>
+      <w:rFonts w:ascii="Poppins" w:hAnsi="Poppins" w:eastAsia="Poppins" w:cs="Poppins"/>
       <w:color w:val="000000"/>
       <w:spacing w:val="5"/>
       <w:kern w:val="28"/>
@@ -8950,7 +8950,7 @@
       <w:spacing w:line="276" w:lineRule="auto" w:after="140"/>
     </w:pPr>
     <w:rPr>
-      <w:rFonts w:asciiTheme="majorHAnsi" w:eastAsiaTheme="majorEastAsia" w:hAnsiTheme="majorHAnsi" w:cstheme="majorBidi" w:ascii="Arial" w:hAnsi="Arial"/>
+      <w:rFonts w:asciiTheme="majorHAnsi" w:eastAsiaTheme="majorEastAsia" w:hAnsiTheme="majorHAnsi" w:cstheme="majorBidi" w:ascii="Inter" w:hAnsi="Inter"/>
       <w:i/>
       <w:iCs/>
       <w:color w:val="000000"/>
@@ -9097,7 +9097,7 @@
       <w:contextualSpacing/>
     </w:pPr>
     <w:rPr>
-      <w:rFonts w:ascii="Arial" w:hAnsi="Arial"/>
+      <w:rFonts w:ascii="Inter" w:hAnsi="Inter"/>
       <w:color w:val="000000"/>
       <w:sz w:val="21"/>
       <w:lang w:val="de-DE"/>
@@ -32058,6 +32058,198 @@
 </w:styles>
 </file>
 
+<file path=word/fonts/Inter-OFL.txt>Copyright 2020 The Inter Project Authors (https://github.com/rsms/inter)
+
+This Font Software is licensed under the SIL Open Font License, Version 1.1.
+This license is copied below, and is also available with a FAQ at:
+https://scripts.sil.org/OFL
+
+
+-----------------------------------------------------------
+SIL OPEN FONT LICENSE Version 1.1 - 26 February 2007
+-----------------------------------------------------------
+
+PREAMBLE
+The goals of the Open Font License (OFL) are to stimulate worldwide
+development of collaborative font projects, to support the font creation
+efforts of academic and linguistic communities, and to provide a free and
+open framework in which fonts may be shared and improved in partnership
+with others.
+
+The OFL allows the licensed fonts to be used, studied, modified and
+redistributed freely as long as they are not sold by themselves. The
+fonts, including any derivative works, can be bundled, embedded, 
+redistributed and/or sold with any software provided that any reserved
+names are not used by derivative works. The fonts and derivatives,
+however, cannot be released under any other type of license. The
+requirement for fonts to remain under this license does not apply
+to any document created using the fonts or their derivatives.
+
+DEFINITIONS
+"Font Software" refers to the set of files released by the Copyright
+Holder(s) under this license and clearly marked as such. This may
+include source files, build scripts and documentation.
+
+"Reserved Font Name" refers to any names specified as such after the
+copyright statement(s).
+
+"Original Version" refers to the collection of Font Software components as
+distributed by the Copyright Holder(s).
+
+"Modified Version" refers to any derivative made by adding to, deleting,
+or substituting -- in part or in whole -- any of the components of the
+Original Version, by changing formats or by porting the Font Software to a
+new environment.
+
+"Author" refers to any designer, engineer, programmer, technical
+writer or other person who contributed to the Font Software.
+
+PERMISSION & CONDITIONS
+Permission is hereby granted, free of charge, to any person obtaining
+a copy of the Font Software, to use, study, copy, merge, embed, modify,
+redistribute, and sell modified and unmodified copies of the Font
+Software, subject to the following conditions:
+
+1) Neither the Font Software nor any of its individual components,
+in Original or Modified Versions, may be sold by itself.
+
+2) Original or Modified Versions of the Font Software may be bundled,
+redistributed and/or sold with any software, provided that each copy
+contains the above copyright notice and this license. These can be
+included either as stand-alone text files, human-readable headers or
+in the appropriate machine-readable metadata fields within text or
+binary files as long as those fields can be easily viewed by the user.
+
+3) No Modified Version of the Font Software may use the Reserved Font
+Name(s) unless explicit written permission is granted by the corresponding
+Copyright Holder. This restriction only applies to the primary font name as
+presented to the users.
+
+4) The name(s) of the Copyright Holder(s) or the Author(s) of the Font
+Software shall not be used to promote, endorse or advertise any
+Modified Version, except to acknowledge the contribution(s) of the
+Copyright Holder(s) and the Author(s) or with their explicit written
+permission.
+
+5) The Font Software, modified or unmodified, in part or in whole,
+must be distributed entirely under this license, and must not be
+distributed under any other license. The requirement for fonts to
+remain under this license does not apply to any document created
+using the Font Software.
+
+TERMINATION
+This license becomes null and void if any of the above conditions are
+not met.
+
+DISCLAIMER
+THE FONT SOFTWARE IS PROVIDED "AS IS", WITHOUT WARRANTY OF ANY KIND,
+EXPRESS OR IMPLIED, INCLUDING BUT NOT LIMITED TO ANY WARRANTIES OF
+MERCHANTABILITY, FITNESS FOR A PARTICULAR PURPOSE AND NONINFRINGEMENT
+OF COPYRIGHT, PATENT, TRADEMARK, OR OTHER RIGHT. IN NO EVENT SHALL THE
+COPYRIGHT HOLDER BE LIABLE FOR ANY CLAIM, DAMAGES OR OTHER LIABILITY,
+INCLUDING ANY GENERAL, SPECIAL, INDIRECT, INCIDENTAL, OR CONSEQUENTIAL
+DAMAGES, WHETHER IN AN ACTION OF CONTRACT, TORT OR OTHERWISE, ARISING
+FROM, OUT OF THE USE OR INABILITY TO USE THE FONT SOFTWARE OR FROM
+OTHER DEALINGS IN THE FONT SOFTWARE.
+
+</file>
+
+<file path=word/fonts/Poppins-OFL.txt>Copyright 2020 The Poppins Project Authors (https://github.com/itfoundry/Poppins)
+
+This Font Software is licensed under the SIL Open Font License, Version 1.1.
+This license is copied below, and is also available with a FAQ at:
+http://scripts.sil.org/OFL
+
+
+-----------------------------------------------------------
+SIL OPEN FONT LICENSE Version 1.1 - 26 February 2007
+-----------------------------------------------------------
+
+PREAMBLE
+The goals of the Open Font License (OFL) are to stimulate worldwide
+development of collaborative font projects, to support the font creation
+efforts of academic and linguistic communities, and to provide a free and
+open framework in which fonts may be shared and improved in partnership
+with others.
+
+The OFL allows the licensed fonts to be used, studied, modified and
+redistributed freely as long as they are not sold by themselves. The
+fonts, including any derivative works, can be bundled, embedded, 
+redistributed and/or sold with any software provided that any reserved
+names are not used by derivative works. The fonts and derivatives,
+however, cannot be released under any other type of license. The
+requirement for fonts to remain under this license does not apply
+to any document created using the fonts or their derivatives.
+
+DEFINITIONS
+"Font Software" refers to the set of files released by the Copyright
+Holder(s) under this license and clearly marked as such. This may
+include source files, build scripts and documentation.
+
+"Reserved Font Name" refers to any names specified as such after the
+copyright statement(s).
+
+"Original Version" refers to the collection of Font Software components as
+distributed by the Copyright Holder(s).
+
+"Modified Version" refers to any derivative made by adding to, deleting,
+or substituting -- in part or in whole -- any of the components of the
+Original Version, by changing formats or by porting the Font Software to a
+new environment.
+
+"Author" refers to any designer, engineer, programmer, technical
+writer or other person who contributed to the Font Software.
+
+PERMISSION & CONDITIONS
+Permission is hereby granted, free of charge, to any person obtaining
+a copy of the Font Software, to use, study, copy, merge, embed, modify,
+redistribute, and sell modified and unmodified copies of the Font
+Software, subject to the following conditions:
+
+1) Neither the Font Software nor any of its individual components,
+in Original or Modified Versions, may be sold by itself.
+
+2) Original or Modified Versions of the Font Software may be bundled,
+redistributed and/or sold with any software, provided that each copy
+contains the above copyright notice and this license. These can be
+included either as stand-alone text files, human-readable headers or
+in the appropriate machine-readable metadata fields within text or
+binary files as long as those fields can be easily viewed by the user.
+
+3) No Modified Version of the Font Software may use the Reserved Font
+Name(s) unless explicit written permission is granted by the corresponding
+Copyright Holder. This restriction only applies to the primary font name as
+presented to the users.
+
+4) The name(s) of the Copyright Holder(s) or the Author(s) of the Font
+Software shall not be used to promote, endorse or advertise any
+Modified Version, except to acknowledge the contribution(s) of the
+Copyright Holder(s) and the Author(s) or with their explicit written
+permission.
+
+5) The Font Software, modified or unmodified, in part or in whole,
+must be distributed entirely under this license, and must not be
+distributed under any other license. The requirement for fonts to
+remain under this license does not apply to any document created
+using the Font Software.
+
+TERMINATION
+This license becomes null and void if any of the above conditions are
+not met.
+
+DISCLAIMER
+THE FONT SOFTWARE IS PROVIDED "AS IS", WITHOUT WARRANTY OF ANY KIND,
+EXPRESS OR IMPLIED, INCLUDING BUT NOT LIMITED TO ANY WARRANTIES OF
+MERCHANTABILITY, FITNESS FOR A PARTICULAR PURPOSE AND NONINFRINGEMENT
+OF COPYRIGHT, PATENT, TRADEMARK, OR OTHER RIGHT. IN NO EVENT SHALL THE
+COPYRIGHT HOLDER BE LIABLE FOR ANY CLAIM, DAMAGES OR OTHER LIABILITY,
+INCLUDING ANY GENERAL, SPECIAL, INDIRECT, INCIDENTAL, OR CONSEQUENTIAL
+DAMAGES, WHETHER IN AN ACTION OF CONTRACT, TORT OR OTHERWISE, ARISING
+FROM, OUT OF THE USE OR INABILITY TO USE THE FONT SOFTWARE OR FROM
+OTHER DEALINGS IN THE FONT SOFTWARE.
+
+</file>
+
 <file path=word/theme/theme1.xml><?xml version="1.0" encoding="utf-8"?>
 <a:theme xmlns:a="http://schemas.openxmlformats.org/drawingml/2006/main" name="Office Theme">
   <a:themeElements>
@@ -32101,7 +32293,7 @@
     </a:clrScheme>
     <a:fontScheme name="Office">
       <a:majorFont>
-        <a:latin typeface="Calibri"/>
+        <a:latin typeface="Poppins"/>
         <a:ea typeface=""/>
         <a:cs typeface=""/>
         <a:font script="Jpan" typeface="ＭＳ ゴシック"/>
@@ -32136,7 +32328,7 @@
         <a:font script="Geor" typeface="Sylfaen"/>
       </a:majorFont>
       <a:minorFont>
-        <a:latin typeface="Cambria"/>
+        <a:latin typeface="Inter"/>
         <a:ea typeface=""/>
         <a:cs typeface=""/>
         <a:font script="Jpan" typeface="ＭＳ 明朝"/>

</xml_diff>

<commit_message>
Add dedicated links page to curriculum Word documents
</commit_message>
<xml_diff>
--- a/downloads/Curriculum_Mensch_und_Umwelt_Thomaeum.docx
+++ b/downloads/Curriculum_Mensch_und_Umwelt_Thomaeum.docx
@@ -75,12 +75,44 @@
       </w:r>
     </w:p>
     <w:p>
-      <w:hyperlink r:id="rId11">
+      <w:pPr>
+        <w:pStyle w:val="Heading1"/>
+        <w:pageBreakBefore/>
+        <w:spacing w:after="440"/>
+      </w:pPr>
+      <w:r>
+        <w:t>Links und Onlinefassungen</w:t>
+      </w:r>
+    </w:p>
+    <w:p>
+      <w:pPr>
+        <w:spacing w:before="160" w:after="240"/>
+      </w:pPr>
+      <w:hyperlink r:id="rId22">
         <w:r>
           <w:rPr>
+            <w:rFonts w:ascii="Inter" w:hAnsi="Inter" w:eastAsia="Inter" w:cs="Inter"/>
             <w:color w:val="17594E"/>
+            <w:u w:val="single"/>
+            <w:sz w:val="25"/>
           </w:rPr>
-          <w:t>Onlinefassung des Curriculums</w:t>
+          <w:t>Notion · Mensch und Umwelt  ↗</w:t>
+        </w:r>
+      </w:hyperlink>
+    </w:p>
+    <w:p>
+      <w:pPr>
+        <w:spacing w:before="160" w:after="240"/>
+      </w:pPr>
+      <w:hyperlink r:id="rId23">
+        <w:r>
+          <w:rPr>
+            <w:rFonts w:ascii="Inter" w:hAnsi="Inter" w:eastAsia="Inter" w:cs="Inter"/>
+            <w:color w:val="17594E"/>
+            <w:u w:val="single"/>
+            <w:sz w:val="25"/>
+          </w:rPr>
+          <w:t>Onlinefassung des Curriculums  ↗</w:t>
         </w:r>
       </w:hyperlink>
     </w:p>

</xml_diff>

<commit_message>
Make curriculum cover titles bold in Word and PDF downloads
</commit_message>
<xml_diff>
--- a/downloads/Curriculum_Mensch_und_Umwelt_Thomaeum.docx
+++ b/downloads/Curriculum_Mensch_und_Umwelt_Thomaeum.docx
@@ -24,6 +24,9 @@
         <w:spacing w:after="480"/>
       </w:pPr>
       <w:r>
+        <w:rPr>
+          <w:b w:val="1"/>
+        </w:rPr>
         <w:t>Mensch</w:t>
         <w:br/>
         <w:t>und Umwelt</w:t>
@@ -8942,6 +8945,7 @@
       <w:contextualSpacing/>
     </w:pPr>
     <w:rPr>
+      <w:b w:val="1"/>
       <w:rFonts w:ascii="Poppins" w:hAnsi="Poppins" w:eastAsia="Poppins" w:cs="Poppins"/>
       <w:color w:val="000000"/>
       <w:spacing w:val="5"/>

</xml_diff>

<commit_message>
Entferne Bedienhinweise unter den Inhaltsübersichten aller vier Curricula
</commit_message>
<xml_diff>
--- a/downloads/Curriculum_Mensch_und_Umwelt_Thomaeum.docx
+++ b/downloads/Curriculum_Mensch_und_Umwelt_Thomaeum.docx
@@ -236,11 +236,6 @@
           <w:t>8 Quellen und Geltungsstand</w:t>
         </w:r>
       </w:hyperlink>
-    </w:p>
-    <w:p>
-      <w:r>
-        <w:t>Die Kapitel sind in Word und in der Onlinefassung direkt anwählbar. Die Kompetenzkennungen verbinden Lernziele, Unterrichtsvorhaben und Nachweise.</w:t>
-      </w:r>
     </w:p>
     <w:p>
       <w:pPr>

</xml_diff>